<commit_message>
Give every appendix photo the same centered 4:3 frame
Rows were uneven because each photo kept its own width. Every photo now
sits in an identical 4:3 frame, so all rows have the same width and are
centered; photos of another shape fill the frame with Word's reversible
crop instead of being stretched.

Co-Authored-By: Claude Opus 5.5 <noreply@anthropic.com>
Claude-Session: https://claude.ai/code/session_0173gXKYWtfoV9wTjmsnRgGb
</commit_message>
<xml_diff>
--- a/output/RD_Volunteer_August2569_Appendix.docx
+++ b/output/RD_Volunteer_August2569_Appendix.docx
@@ -4088,7 +4088,7 @@
     </w:p>
     <w:tbl>
       <w:tblPr>
-        <w:tblW w:w="8083" w:type="dxa"/>
+        <w:tblW w:w="12396" w:type="dxa"/>
         <w:jc w:val="center"/>
         <w:tblBorders>
           <w:top w:val="nil"/>
@@ -4108,10 +4108,10 @@
         <w:tblLook w:val="0000" w:firstRow="0" w:lastRow="0" w:firstColumn="0" w:lastColumn="0" w:noHBand="1" w:noVBand="1"/>
       </w:tblPr>
       <w:tblGrid>
-        <w:gridCol w:w="1439"/>
-        <w:gridCol w:w="1439"/>
-        <w:gridCol w:w="1439"/>
-        <w:gridCol w:w="3766"/>
+        <w:gridCol w:w="3099"/>
+        <w:gridCol w:w="3099"/>
+        <w:gridCol w:w="3099"/>
+        <w:gridCol w:w="3099"/>
       </w:tblGrid>
       <w:tr>
         <w:trPr>
@@ -4120,7 +4120,7 @@
         </w:trPr>
         <w:tc>
           <w:tcPr>
-            <w:tcW w:w="1439" w:type="dxa"/>
+            <w:tcW w:w="3099" w:type="dxa"/>
             <w:vAlign w:val="center"/>
           </w:tcPr>
           <w:p>
@@ -4134,7 +4134,7 @@
               </w:rPr>
               <w:drawing>
                 <wp:inline xmlns:a="http://schemas.openxmlformats.org/drawingml/2006/main" xmlns:pic="http://schemas.openxmlformats.org/drawingml/2006/picture">
-                  <wp:extent cx="769800" cy="1368000"/>
+                  <wp:extent cx="1824000" cy="1368000"/>
                   <wp:docPr id="218" name="Picture 218" descr="A01_P01_IMG_2507.jpeg"/>
                   <wp:cNvGraphicFramePr>
                     <a:graphicFrameLocks noChangeAspect="1"/>
@@ -4148,6 +4148,7 @@
                         </pic:nvPicPr>
                         <pic:blipFill>
                           <a:blip r:embed="rId4"/>
+                          <a:srcRect l="0" t="28898" r="0" b="28898"/>
                           <a:stretch>
                             <a:fillRect/>
                           </a:stretch>
@@ -4155,7 +4156,7 @@
                         <pic:spPr>
                           <a:xfrm>
                             <a:off x="0" y="0"/>
-                            <a:ext cx="769800" cy="1368000"/>
+                            <a:ext cx="1824000" cy="1368000"/>
                           </a:xfrm>
                           <a:prstGeom prst="rect"/>
                         </pic:spPr>
@@ -4169,7 +4170,7 @@
         </w:tc>
         <w:tc>
           <w:tcPr>
-            <w:tcW w:w="1439" w:type="dxa"/>
+            <w:tcW w:w="3099" w:type="dxa"/>
             <w:vAlign w:val="center"/>
           </w:tcPr>
           <w:p>
@@ -4183,7 +4184,7 @@
               </w:rPr>
               <w:drawing>
                 <wp:inline xmlns:a="http://schemas.openxmlformats.org/drawingml/2006/main" xmlns:pic="http://schemas.openxmlformats.org/drawingml/2006/picture">
-                  <wp:extent cx="769800" cy="1368000"/>
+                  <wp:extent cx="1824000" cy="1368000"/>
                   <wp:docPr id="219" name="Picture 218" descr="A01_P02_IMG_2506.jpeg"/>
                   <wp:cNvGraphicFramePr>
                     <a:graphicFrameLocks noChangeAspect="1"/>
@@ -4197,6 +4198,7 @@
                         </pic:nvPicPr>
                         <pic:blipFill>
                           <a:blip r:embed="rId5"/>
+                          <a:srcRect l="0" t="28898" r="0" b="28898"/>
                           <a:stretch>
                             <a:fillRect/>
                           </a:stretch>
@@ -4204,7 +4206,7 @@
                         <pic:spPr>
                           <a:xfrm>
                             <a:off x="0" y="0"/>
-                            <a:ext cx="769800" cy="1368000"/>
+                            <a:ext cx="1824000" cy="1368000"/>
                           </a:xfrm>
                           <a:prstGeom prst="rect"/>
                         </pic:spPr>
@@ -4218,7 +4220,7 @@
         </w:tc>
         <w:tc>
           <w:tcPr>
-            <w:tcW w:w="1439" w:type="dxa"/>
+            <w:tcW w:w="3099" w:type="dxa"/>
             <w:vAlign w:val="center"/>
           </w:tcPr>
           <w:p>
@@ -4232,7 +4234,7 @@
               </w:rPr>
               <w:drawing>
                 <wp:inline xmlns:a="http://schemas.openxmlformats.org/drawingml/2006/main" xmlns:pic="http://schemas.openxmlformats.org/drawingml/2006/picture">
-                  <wp:extent cx="769800" cy="1368000"/>
+                  <wp:extent cx="1824000" cy="1368000"/>
                   <wp:docPr id="220" name="Picture 218" descr="A01_P03_IMG_2509.jpeg"/>
                   <wp:cNvGraphicFramePr>
                     <a:graphicFrameLocks noChangeAspect="1"/>
@@ -4246,6 +4248,7 @@
                         </pic:nvPicPr>
                         <pic:blipFill>
                           <a:blip r:embed="rId6"/>
+                          <a:srcRect l="0" t="28898" r="0" b="28898"/>
                           <a:stretch>
                             <a:fillRect/>
                           </a:stretch>
@@ -4253,7 +4256,7 @@
                         <pic:spPr>
                           <a:xfrm>
                             <a:off x="0" y="0"/>
-                            <a:ext cx="769800" cy="1368000"/>
+                            <a:ext cx="1824000" cy="1368000"/>
                           </a:xfrm>
                           <a:prstGeom prst="rect"/>
                         </pic:spPr>
@@ -4267,7 +4270,7 @@
         </w:tc>
         <w:tc>
           <w:tcPr>
-            <w:tcW w:w="3766" w:type="dxa"/>
+            <w:tcW w:w="3099" w:type="dxa"/>
             <w:vAlign w:val="center"/>
           </w:tcPr>
           <w:p>
@@ -4281,7 +4284,7 @@
               </w:rPr>
               <w:drawing>
                 <wp:inline xmlns:a="http://schemas.openxmlformats.org/drawingml/2006/main" xmlns:pic="http://schemas.openxmlformats.org/drawingml/2006/picture">
-                  <wp:extent cx="2247911" cy="1368000"/>
+                  <wp:extent cx="1824000" cy="1368000"/>
                   <wp:docPr id="221" name="Picture 218" descr="A01_P04_IMG_2505.jpeg"/>
                   <wp:cNvGraphicFramePr>
                     <a:graphicFrameLocks noChangeAspect="1"/>
@@ -4295,6 +4298,7 @@
                         </pic:nvPicPr>
                         <pic:blipFill>
                           <a:blip r:embed="rId7"/>
+                          <a:srcRect l="9429" t="0" r="9429" b="0"/>
                           <a:stretch>
                             <a:fillRect/>
                           </a:stretch>
@@ -4302,7 +4306,7 @@
                         <pic:spPr>
                           <a:xfrm>
                             <a:off x="0" y="0"/>
-                            <a:ext cx="2247911" cy="1368000"/>
+                            <a:ext cx="1824000" cy="1368000"/>
                           </a:xfrm>
                           <a:prstGeom prst="rect"/>
                         </pic:spPr>
@@ -4338,7 +4342,7 @@
     </w:p>
     <w:tbl>
       <w:tblPr>
-        <w:tblW w:w="12751" w:type="dxa"/>
+        <w:tblW w:w="12396" w:type="dxa"/>
         <w:jc w:val="center"/>
         <w:tblBorders>
           <w:top w:val="nil"/>
@@ -4358,10 +4362,10 @@
         <w:tblLook w:val="0000" w:firstRow="0" w:lastRow="0" w:firstColumn="0" w:lastColumn="0" w:noHBand="1" w:noVBand="1"/>
       </w:tblPr>
       <w:tblGrid>
-        <w:gridCol w:w="3098"/>
-        <w:gridCol w:w="3098"/>
-        <w:gridCol w:w="3098"/>
-        <w:gridCol w:w="3457"/>
+        <w:gridCol w:w="3099"/>
+        <w:gridCol w:w="3099"/>
+        <w:gridCol w:w="3099"/>
+        <w:gridCol w:w="3099"/>
       </w:tblGrid>
       <w:tr>
         <w:trPr>
@@ -4370,7 +4374,7 @@
         </w:trPr>
         <w:tc>
           <w:tcPr>
-            <w:tcW w:w="3098" w:type="dxa"/>
+            <w:tcW w:w="3099" w:type="dxa"/>
             <w:vAlign w:val="center"/>
           </w:tcPr>
           <w:p>
@@ -4384,7 +4388,7 @@
               </w:rPr>
               <w:drawing>
                 <wp:inline xmlns:a="http://schemas.openxmlformats.org/drawingml/2006/main" xmlns:pic="http://schemas.openxmlformats.org/drawingml/2006/picture">
-                  <wp:extent cx="1823588" cy="1368000"/>
+                  <wp:extent cx="1824000" cy="1368000"/>
                   <wp:docPr id="222" name="Picture 218" descr="A02_P01_IMG_2513.jpeg"/>
                   <wp:cNvGraphicFramePr>
                     <a:graphicFrameLocks noChangeAspect="1"/>
@@ -4398,6 +4402,7 @@
                         </pic:nvPicPr>
                         <pic:blipFill>
                           <a:blip r:embed="rId8"/>
+                          <a:srcRect l="0" t="11" r="0" b="12"/>
                           <a:stretch>
                             <a:fillRect/>
                           </a:stretch>
@@ -4405,7 +4410,7 @@
                         <pic:spPr>
                           <a:xfrm>
                             <a:off x="0" y="0"/>
-                            <a:ext cx="1823588" cy="1368000"/>
+                            <a:ext cx="1824000" cy="1368000"/>
                           </a:xfrm>
                           <a:prstGeom prst="rect"/>
                         </pic:spPr>
@@ -4419,7 +4424,7 @@
         </w:tc>
         <w:tc>
           <w:tcPr>
-            <w:tcW w:w="3098" w:type="dxa"/>
+            <w:tcW w:w="3099" w:type="dxa"/>
             <w:vAlign w:val="center"/>
           </w:tcPr>
           <w:p>
@@ -4433,7 +4438,7 @@
               </w:rPr>
               <w:drawing>
                 <wp:inline xmlns:a="http://schemas.openxmlformats.org/drawingml/2006/main" xmlns:pic="http://schemas.openxmlformats.org/drawingml/2006/picture">
-                  <wp:extent cx="1823588" cy="1368000"/>
+                  <wp:extent cx="1824000" cy="1368000"/>
                   <wp:docPr id="223" name="Picture 218" descr="A02_P02_IMG_2514.jpeg"/>
                   <wp:cNvGraphicFramePr>
                     <a:graphicFrameLocks noChangeAspect="1"/>
@@ -4447,6 +4452,7 @@
                         </pic:nvPicPr>
                         <pic:blipFill>
                           <a:blip r:embed="rId9"/>
+                          <a:srcRect l="0" t="11" r="0" b="12"/>
                           <a:stretch>
                             <a:fillRect/>
                           </a:stretch>
@@ -4454,7 +4460,7 @@
                         <pic:spPr>
                           <a:xfrm>
                             <a:off x="0" y="0"/>
-                            <a:ext cx="1823588" cy="1368000"/>
+                            <a:ext cx="1824000" cy="1368000"/>
                           </a:xfrm>
                           <a:prstGeom prst="rect"/>
                         </pic:spPr>
@@ -4468,7 +4474,7 @@
         </w:tc>
         <w:tc>
           <w:tcPr>
-            <w:tcW w:w="3098" w:type="dxa"/>
+            <w:tcW w:w="3099" w:type="dxa"/>
             <w:vAlign w:val="center"/>
           </w:tcPr>
           <w:p>
@@ -4482,7 +4488,7 @@
               </w:rPr>
               <w:drawing>
                 <wp:inline xmlns:a="http://schemas.openxmlformats.org/drawingml/2006/main" xmlns:pic="http://schemas.openxmlformats.org/drawingml/2006/picture">
-                  <wp:extent cx="1823588" cy="1368000"/>
+                  <wp:extent cx="1824000" cy="1368000"/>
                   <wp:docPr id="224" name="Picture 218" descr="A02_P03_IMG_2520.jpeg"/>
                   <wp:cNvGraphicFramePr>
                     <a:graphicFrameLocks noChangeAspect="1"/>
@@ -4496,6 +4502,7 @@
                         </pic:nvPicPr>
                         <pic:blipFill>
                           <a:blip r:embed="rId10"/>
+                          <a:srcRect l="0" t="11" r="0" b="12"/>
                           <a:stretch>
                             <a:fillRect/>
                           </a:stretch>
@@ -4503,7 +4510,7 @@
                         <pic:spPr>
                           <a:xfrm>
                             <a:off x="0" y="0"/>
-                            <a:ext cx="1823588" cy="1368000"/>
+                            <a:ext cx="1824000" cy="1368000"/>
                           </a:xfrm>
                           <a:prstGeom prst="rect"/>
                         </pic:spPr>
@@ -4517,7 +4524,7 @@
         </w:tc>
         <w:tc>
           <w:tcPr>
-            <w:tcW w:w="3457" w:type="dxa"/>
+            <w:tcW w:w="3099" w:type="dxa"/>
             <w:vAlign w:val="center"/>
           </w:tcPr>
           <w:p>
@@ -4531,7 +4538,7 @@
               </w:rPr>
               <w:drawing>
                 <wp:inline xmlns:a="http://schemas.openxmlformats.org/drawingml/2006/main" xmlns:pic="http://schemas.openxmlformats.org/drawingml/2006/picture">
-                  <wp:extent cx="2051345" cy="1368000"/>
+                  <wp:extent cx="1824000" cy="1368000"/>
                   <wp:docPr id="225" name="Picture 218" descr="A02_P04_IMG_2522.jpeg"/>
                   <wp:cNvGraphicFramePr>
                     <a:graphicFrameLocks noChangeAspect="1"/>
@@ -4545,6 +4552,7 @@
                         </pic:nvPicPr>
                         <pic:blipFill>
                           <a:blip r:embed="rId11"/>
+                          <a:srcRect l="5541" t="0" r="5541" b="0"/>
                           <a:stretch>
                             <a:fillRect/>
                           </a:stretch>
@@ -4552,7 +4560,7 @@
                         <pic:spPr>
                           <a:xfrm>
                             <a:off x="0" y="0"/>
-                            <a:ext cx="2051345" cy="1368000"/>
+                            <a:ext cx="1824000" cy="1368000"/>
                           </a:xfrm>
                           <a:prstGeom prst="rect"/>
                         </pic:spPr>

</xml_diff>